<commit_message>
fix: update Archive image alt to GULF TIMES，2023; rename 婆罗门之花 to 梵花 · 缅甸
</commit_message>
<xml_diff>
--- a/content/docx/zh/text-2.docx
+++ b/content/docx/zh/text-2.docx
@@ -191,7 +191,7 @@
         <w:spacing w:after="40"/>
       </w:pPr>
       <w:r>
-        <w:t>2013 –《婆罗门之花：缅甸》，漓江出版社，中国</w:t>
+        <w:t>2013 –《梵花 · 缅甸》，漓江出版社，中国</w:t>
       </w:r>
     </w:p>
     <w:p>
@@ -519,7 +519,7 @@
         <w:spacing w:after="40"/>
       </w:pPr>
       <w:r>
-        <w:t>2018.5.25–6.5 –《婆罗门之花：缅甸》，东莞文化馆，东莞，中国</w:t>
+        <w:t>2018.5.25–6.5 –《梵花 · 缅甸》，东莞文化馆，东莞，中国</w:t>
       </w:r>
     </w:p>
     <w:p>
@@ -527,7 +527,7 @@
         <w:spacing w:after="40"/>
       </w:pPr>
       <w:r>
-        <w:t>2018.1.20–3.3 –《婆罗门之花：缅甸》，来宾，中国</w:t>
+        <w:t>2018.1.20–3.3 –《梵花 · 缅甸》，来宾，中国</w:t>
       </w:r>
     </w:p>
     <w:p>
@@ -535,7 +535,7 @@
         <w:spacing w:after="40"/>
       </w:pPr>
       <w:r>
-        <w:t>2019.1.5–2.20 –《婆罗门之花：缅甸》，南宁博物馆，南宁，中国</w:t>
+        <w:t>2019.1.5–2.20 –《梵花 · 缅甸》，南宁博物馆，南宁，中国</w:t>
       </w:r>
     </w:p>
     <w:p>
@@ -543,7 +543,7 @@
         <w:spacing w:after="40"/>
       </w:pPr>
       <w:r>
-        <w:t>2019.3.26–6.26 –《婆罗门之花：缅甸》，三亚凤凰岛，三亚，中国</w:t>
+        <w:t>2019.3.26–6.26 –《梵花 · 缅甸》，三亚凤凰岛，三亚，中国</w:t>
       </w:r>
     </w:p>
     <w:p>
@@ -559,7 +559,7 @@
         <w:spacing w:after="40"/>
       </w:pPr>
       <w:r>
-        <w:t>2019.11.30–12.10 –《婆罗门之花：缅甸》，华兴美术馆，桂林，中国</w:t>
+        <w:t>2019.11.30–12.10 –《梵花 · 缅甸》，华兴美术馆，桂林，中国</w:t>
       </w:r>
     </w:p>
     <w:p>

</xml_diff>